<commit_message>
Redo Labs 1-3 for Problem Statement #60 (Podcast Guest Scheduling & Outline Builder)
Lab 1: new requirements table, use-case diagram and UC-02 Book Interview Slot flow.
Lab 2: epics, stories, sprint plan and Jira CSV rebuilt from the new requirements.
Lab 3: layered component diagram and justification for the podcast system.

Co-Authored-By: Claude Opus 5.5 <noreply@anthropic.com>
</commit_message>
<xml_diff>
--- a/Lab-1/Lab1_Requirements_Table.docx
+++ b/Lab-1/Lab1_Requirements_Table.docx
@@ -12,7 +12,7 @@
           <w:color w:val="1F3A68"/>
           <w:sz w:val="32"/>
         </w:rPr>
-        <w:t>Lab 1: Requirements Table - Self-Service Coffee Kiosk</w:t>
+        <w:t>Lab 1: Requirements Table - Podcast Guest Scheduling &amp; Outline Builder</w:t>
       </w:r>
     </w:p>
     <w:p>
@@ -33,7 +33,7 @@
       </w:r>
       <w:r>
         <w:rPr/>
-        <w:t xml:space="preserve"> Self-Service Coffee Kiosk in a busy cafe: customers choose one of 3 coffee types (Espresso, Americano, Latte) in 2 sizes (Small, Large), pay by credit card only, and receive a printed receipt. The kiosk uses a touch screen, a receipt printer, and stores menu and pricing data.</w:t>
+        <w:t xml:space="preserve"> Problem Statement #60 (Media, Events &amp; Community): a media production organizer that lets podcast hosts share booking availability, collect guest talking-point outlines, and generate timestamped run-of-show episode production notes. Actors: Podcast Guest, Show Host.</w:t>
       </w:r>
     </w:p>
     <w:tbl>
@@ -71,7 +71,7 @@
         </w:tc>
         <w:tc>
           <w:tcPr>
-            <w:tcW w:type="dxa" w:w="1296"/>
+            <w:tcW w:type="dxa" w:w="1368"/>
             <w:shd w:val="clear" w:color="auto" w:fill="D9E2F3"/>
           </w:tcPr>
           <w:p>
@@ -87,7 +87,7 @@
         </w:tc>
         <w:tc>
           <w:tcPr>
-            <w:tcW w:type="dxa" w:w="2952"/>
+            <w:tcW w:type="dxa" w:w="3024"/>
             <w:shd w:val="clear" w:color="auto" w:fill="D9E2F3"/>
           </w:tcPr>
           <w:p>
@@ -119,7 +119,7 @@
         </w:tc>
         <w:tc>
           <w:tcPr>
-            <w:tcW w:type="dxa" w:w="3528"/>
+            <w:tcW w:type="dxa" w:w="3456"/>
             <w:shd w:val="clear" w:color="auto" w:fill="D9E2F3"/>
           </w:tcPr>
           <w:p>
@@ -135,7 +135,7 @@
         </w:tc>
         <w:tc>
           <w:tcPr>
-            <w:tcW w:type="dxa" w:w="2232"/>
+            <w:tcW w:type="dxa" w:w="2160"/>
             <w:shd w:val="clear" w:color="auto" w:fill="D9E2F3"/>
           </w:tcPr>
           <w:p>
@@ -151,7 +151,7 @@
         </w:tc>
         <w:tc>
           <w:tcPr>
-            <w:tcW w:type="dxa" w:w="2448"/>
+            <w:tcW w:type="dxa" w:w="2304"/>
             <w:shd w:val="clear" w:color="auto" w:fill="D9E2F3"/>
           </w:tcPr>
           <w:p>
@@ -183,7 +183,7 @@
         </w:tc>
         <w:tc>
           <w:tcPr>
-            <w:tcW w:type="dxa" w:w="1296"/>
+            <w:tcW w:type="dxa" w:w="1368"/>
           </w:tcPr>
           <w:p>
             <w:r/>
@@ -197,7 +197,7 @@
         </w:tc>
         <w:tc>
           <w:tcPr>
-            <w:tcW w:type="dxa" w:w="2952"/>
+            <w:tcW w:type="dxa" w:w="3024"/>
           </w:tcPr>
           <w:p>
             <w:r/>
@@ -205,7 +205,7 @@
               <w:rPr>
                 <w:sz w:val="17"/>
               </w:rPr>
-              <w:t>The system shall allow a customer to select a coffee type (Espresso, Americano or Latte) from the touch-screen menu.</w:t>
+              <w:t>The system shall allow guests to select interview time slots and submit structured bullet points for discussion topics with biography links.</w:t>
             </w:r>
           </w:p>
         </w:tc>
@@ -225,7 +225,7 @@
         </w:tc>
         <w:tc>
           <w:tcPr>
-            <w:tcW w:type="dxa" w:w="3528"/>
+            <w:tcW w:type="dxa" w:w="3456"/>
           </w:tcPr>
           <w:p>
             <w:r/>
@@ -233,13 +233,13 @@
               <w:rPr>
                 <w:sz w:val="17"/>
               </w:rPr>
-              <w:t>When a customer taps "Espresso", the item is highlighted and the screen moves to size selection within 1 s. Repeated for all 3 types.</w:t>
+              <w:t>Pass: slot booked, calendar invite sent, and topic outline attached to the episode board. Fail: booking permitted on a blocked date.</w:t>
             </w:r>
           </w:p>
         </w:tc>
         <w:tc>
           <w:tcPr>
-            <w:tcW w:type="dxa" w:w="2232"/>
+            <w:tcW w:type="dxa" w:w="2160"/>
           </w:tcPr>
           <w:p>
             <w:r/>
@@ -247,13 +247,13 @@
               <w:rPr>
                 <w:sz w:val="17"/>
               </w:rPr>
-              <w:t>Core ordering functionality.</w:t>
+              <w:t>Core purpose of the system: one step books the guest and captures what they will talk about.</w:t>
             </w:r>
           </w:p>
         </w:tc>
         <w:tc>
           <w:tcPr>
-            <w:tcW w:type="dxa" w:w="2448"/>
+            <w:tcW w:type="dxa" w:w="2304"/>
           </w:tcPr>
           <w:p>
             <w:r/>
@@ -261,7 +261,7 @@
               <w:rPr>
                 <w:sz w:val="17"/>
               </w:rPr>
-              <w:t>Given in handout. Listed the 3 menu items so each one is tested.</w:t>
+              <w:t>Given in the problem statement. Kept the pass/fail wording as provided.</w:t>
             </w:r>
           </w:p>
         </w:tc>
@@ -283,7 +283,7 @@
         </w:tc>
         <w:tc>
           <w:tcPr>
-            <w:tcW w:type="dxa" w:w="1296"/>
+            <w:tcW w:type="dxa" w:w="1368"/>
           </w:tcPr>
           <w:p>
             <w:r/>
@@ -297,7 +297,7 @@
         </w:tc>
         <w:tc>
           <w:tcPr>
-            <w:tcW w:type="dxa" w:w="2952"/>
+            <w:tcW w:type="dxa" w:w="3024"/>
           </w:tcPr>
           <w:p>
             <w:r/>
@@ -305,7 +305,7 @@
               <w:rPr>
                 <w:sz w:val="17"/>
               </w:rPr>
-              <w:t>The system shall allow the customer to choose a drink size (Small or Large) for the selected coffee and shall show the price for that size.</w:t>
+              <w:t>The system shall allow the show host to publish recording availability as time slots (date, start time, duration, time zone) and to block dates.</w:t>
             </w:r>
           </w:p>
         </w:tc>
@@ -325,7 +325,7 @@
         </w:tc>
         <w:tc>
           <w:tcPr>
-            <w:tcW w:type="dxa" w:w="3528"/>
+            <w:tcW w:type="dxa" w:w="3456"/>
           </w:tcPr>
           <w:p>
             <w:r/>
@@ -333,13 +333,13 @@
               <w:rPr>
                 <w:sz w:val="17"/>
               </w:rPr>
-              <w:t>For all 6 type/size combinations, the price shown on the summary screen equals the price stored in the menu table.</w:t>
+              <w:t>Host creates a 60-minute slot for Tue 10:00 IST; it appears on the guest booking page within 5 s, shown in the guest's own time zone. A blocked date shows no bookable slots.</w:t>
             </w:r>
           </w:p>
         </w:tc>
         <w:tc>
           <w:tcPr>
-            <w:tcW w:type="dxa" w:w="2232"/>
+            <w:tcW w:type="dxa" w:w="2160"/>
           </w:tcPr>
           <w:p>
             <w:r/>
@@ -347,13 +347,13 @@
               <w:rPr>
                 <w:sz w:val="17"/>
               </w:rPr>
-              <w:t>Price depends on size; the customer must see the correct amount before paying.</w:t>
+              <w:t>Guests can only book times the host has actually offered.</w:t>
             </w:r>
           </w:p>
         </w:tc>
         <w:tc>
           <w:tcPr>
-            <w:tcW w:type="dxa" w:w="2448"/>
+            <w:tcW w:type="dxa" w:w="2304"/>
           </w:tcPr>
           <w:p>
             <w:r/>
@@ -361,7 +361,7 @@
               <w:rPr>
                 <w:sz w:val="17"/>
               </w:rPr>
-              <w:t>"Show price" was vague; now checked against the menu table.</w:t>
+              <w:t>Added time zone handling: guests and hosts are often in different countries.</w:t>
             </w:r>
           </w:p>
         </w:tc>
@@ -383,7 +383,7 @@
         </w:tc>
         <w:tc>
           <w:tcPr>
-            <w:tcW w:type="dxa" w:w="1296"/>
+            <w:tcW w:type="dxa" w:w="1368"/>
           </w:tcPr>
           <w:p>
             <w:r/>
@@ -397,7 +397,7 @@
         </w:tc>
         <w:tc>
           <w:tcPr>
-            <w:tcW w:type="dxa" w:w="2952"/>
+            <w:tcW w:type="dxa" w:w="3024"/>
           </w:tcPr>
           <w:p>
             <w:r/>
@@ -405,7 +405,7 @@
               <w:rPr>
                 <w:sz w:val="17"/>
               </w:rPr>
-              <w:t>The system shall accept payment by credit card through the payment gateway and shall confirm the order only after the gateway approves the payment.</w:t>
+              <w:t>The system shall send a calendar invitation to both the host and the guest when a slot is booked, and an updated invitation when the booking is rescheduled or cancelled.</w:t>
             </w:r>
           </w:p>
         </w:tc>
@@ -425,7 +425,7 @@
         </w:tc>
         <w:tc>
           <w:tcPr>
-            <w:tcW w:type="dxa" w:w="3528"/>
+            <w:tcW w:type="dxa" w:w="3456"/>
           </w:tcPr>
           <w:p>
             <w:r/>
@@ -433,13 +433,13 @@
               <w:rPr>
                 <w:sz w:val="17"/>
               </w:rPr>
-              <w:t>Gateway sandbox test: an approved test card sets the order to PAID and shows a confirmation; a declined test card leaves the order unpaid and shows "Payment declined".</w:t>
+              <w:t>Within 1 minute of booking, both host and guest receive an invite with the correct date, time, episode title and recording link. Rescheduling updates the existing event instead of creating a duplicate.</w:t>
             </w:r>
           </w:p>
         </w:tc>
         <w:tc>
           <w:tcPr>
-            <w:tcW w:type="dxa" w:w="2232"/>
+            <w:tcW w:type="dxa" w:w="2160"/>
           </w:tcPr>
           <w:p>
             <w:r/>
@@ -447,13 +447,13 @@
               <w:rPr>
                 <w:sz w:val="17"/>
               </w:rPr>
-              <w:t>Credit card is the only payment method; prevents handing out unpaid drinks.</w:t>
+              <w:t>Prevents missed or double-booked recordings.</w:t>
             </w:r>
           </w:p>
         </w:tc>
         <w:tc>
           <w:tcPr>
-            <w:tcW w:type="dxa" w:w="2448"/>
+            <w:tcW w:type="dxa" w:w="2304"/>
           </w:tcPr>
           <w:p>
             <w:r/>
@@ -461,7 +461,7 @@
               <w:rPr>
                 <w:sz w:val="17"/>
               </w:rPr>
-              <w:t>Added the declined-card case so the test has a clear pass/fail.</w:t>
+              <w:t>"Send a reminder" was vague; now names who receives it and when.</w:t>
             </w:r>
           </w:p>
         </w:tc>
@@ -483,7 +483,7 @@
         </w:tc>
         <w:tc>
           <w:tcPr>
-            <w:tcW w:type="dxa" w:w="1296"/>
+            <w:tcW w:type="dxa" w:w="1368"/>
           </w:tcPr>
           <w:p>
             <w:r/>
@@ -497,7 +497,7 @@
         </w:tc>
         <w:tc>
           <w:tcPr>
-            <w:tcW w:type="dxa" w:w="2952"/>
+            <w:tcW w:type="dxa" w:w="3024"/>
           </w:tcPr>
           <w:p>
             <w:r/>
@@ -505,7 +505,7 @@
               <w:rPr>
                 <w:sz w:val="17"/>
               </w:rPr>
-              <w:t>The system shall print a receipt showing order number, coffee type, size, price, date/time and the last 4 digits of the card after a successful payment.</w:t>
+              <w:t>The system shall let the host review all guest outlines on an episode board, reorder topics, and set a planned duration for each segment.</w:t>
             </w:r>
           </w:p>
         </w:tc>
@@ -519,13 +519,13 @@
               <w:rPr>
                 <w:sz w:val="17"/>
               </w:rPr>
-              <w:t>High</w:t>
+              <w:t>Medium</w:t>
             </w:r>
           </w:p>
         </w:tc>
         <w:tc>
           <w:tcPr>
-            <w:tcW w:type="dxa" w:w="3528"/>
+            <w:tcW w:type="dxa" w:w="3456"/>
           </w:tcPr>
           <w:p>
             <w:r/>
@@ -533,13 +533,13 @@
               <w:rPr>
                 <w:sz w:val="17"/>
               </w:rPr>
-              <w:t>After a paid test order the receipt contains all 6 fields, and printing starts within 5 s of payment approval.</w:t>
+              <w:t>Host moves topic 3 above topic 1 and sets it to 5 min; after saving and reloading the board the new order and duration are kept, and the guest's original submission is still viewable.</w:t>
             </w:r>
           </w:p>
         </w:tc>
         <w:tc>
           <w:tcPr>
-            <w:tcW w:type="dxa" w:w="2232"/>
+            <w:tcW w:type="dxa" w:w="2160"/>
           </w:tcPr>
           <w:p>
             <w:r/>
@@ -547,13 +547,13 @@
               <w:rPr>
                 <w:sz w:val="17"/>
               </w:rPr>
-              <w:t>Proof of purchase; the order number is used to collect the drink.</w:t>
+              <w:t>The host shapes the episode flow before recording.</w:t>
             </w:r>
           </w:p>
         </w:tc>
         <w:tc>
           <w:tcPr>
-            <w:tcW w:type="dxa" w:w="2448"/>
+            <w:tcW w:type="dxa" w:w="2304"/>
           </w:tcPr>
           <w:p>
             <w:r/>
@@ -561,7 +561,7 @@
               <w:rPr>
                 <w:sz w:val="17"/>
               </w:rPr>
-              <w:t>Listed the exact receipt fields instead of "order details".</w:t>
+              <w:t>Added "original submission kept" so the guest's input is never lost.</w:t>
             </w:r>
           </w:p>
         </w:tc>
@@ -583,7 +583,7 @@
         </w:tc>
         <w:tc>
           <w:tcPr>
-            <w:tcW w:type="dxa" w:w="1296"/>
+            <w:tcW w:type="dxa" w:w="1368"/>
           </w:tcPr>
           <w:p>
             <w:r/>
@@ -597,7 +597,7 @@
         </w:tc>
         <w:tc>
           <w:tcPr>
-            <w:tcW w:type="dxa" w:w="2952"/>
+            <w:tcW w:type="dxa" w:w="3024"/>
           </w:tcPr>
           <w:p>
             <w:r/>
@@ -605,7 +605,7 @@
               <w:rPr>
                 <w:sz w:val="17"/>
               </w:rPr>
-              <w:t>The system shall allow an authenticated administrator to add, edit or disable menu items and their prices.</w:t>
+              <w:t>The system shall generate a timestamped run-of-show for an episode, computing each segment's start time from the planned durations, and export it as a PDF production sheet.</w:t>
             </w:r>
           </w:p>
         </w:tc>
@@ -619,13 +619,13 @@
               <w:rPr>
                 <w:sz w:val="17"/>
               </w:rPr>
-              <w:t>Medium</w:t>
+              <w:t>High</w:t>
             </w:r>
           </w:p>
         </w:tc>
         <w:tc>
           <w:tcPr>
-            <w:tcW w:type="dxa" w:w="3528"/>
+            <w:tcW w:type="dxa" w:w="3456"/>
           </w:tcPr>
           <w:p>
             <w:r/>
@@ -633,13 +633,13 @@
               <w:rPr>
                 <w:sz w:val="17"/>
               </w:rPr>
-              <w:t>Admin changes Small Americano from Rs 120 to Rs 130 and saves; the next customer session shows Rs 130. A wrong admin PIN is rejected.</w:t>
+              <w:t>For segments Intro 2 min, Topic A 10 min, Topic B 8 min, Topic C 5 min, Outro 3 min, the PDF shows start times 00:00, 00:02, 00:12, 00:20, 00:25 and a total length of 28:00.</w:t>
             </w:r>
           </w:p>
         </w:tc>
         <w:tc>
           <w:tcPr>
-            <w:tcW w:type="dxa" w:w="2232"/>
+            <w:tcW w:type="dxa" w:w="2160"/>
           </w:tcPr>
           <w:p>
             <w:r/>
@@ -647,13 +647,13 @@
               <w:rPr>
                 <w:sz w:val="17"/>
               </w:rPr>
-              <w:t>Prices change; the cafe manager must update them without a developer.</w:t>
+              <w:t>Gives the host and producer a single sheet to follow while recording.</w:t>
             </w:r>
           </w:p>
         </w:tc>
         <w:tc>
           <w:tcPr>
-            <w:tcW w:type="dxa" w:w="2448"/>
+            <w:tcW w:type="dxa" w:w="2304"/>
           </w:tcPr>
           <w:p>
             <w:r/>
@@ -661,7 +661,7 @@
               <w:rPr>
                 <w:sz w:val="17"/>
               </w:rPr>
-              <w:t>Added the authentication check so customers cannot change prices.</w:t>
+              <w:t>Made the acceptance test a worked example with exact expected timestamps.</w:t>
             </w:r>
           </w:p>
         </w:tc>
@@ -683,7 +683,7 @@
         </w:tc>
         <w:tc>
           <w:tcPr>
-            <w:tcW w:type="dxa" w:w="1296"/>
+            <w:tcW w:type="dxa" w:w="1368"/>
           </w:tcPr>
           <w:p>
             <w:r/>
@@ -691,13 +691,13 @@
               <w:rPr>
                 <w:sz w:val="17"/>
               </w:rPr>
-              <w:t>Nonfunctional</w:t>
+              <w:t>Nonfunctional (Performance)</w:t>
             </w:r>
           </w:p>
         </w:tc>
         <w:tc>
           <w:tcPr>
-            <w:tcW w:type="dxa" w:w="2952"/>
+            <w:tcW w:type="dxa" w:w="3024"/>
           </w:tcPr>
           <w:p>
             <w:r/>
@@ -705,7 +705,7 @@
               <w:rPr>
                 <w:sz w:val="17"/>
               </w:rPr>
-              <w:t>The system shall complete any order (selection to payment) in under 60 s.</w:t>
+              <w:t>The show outline generator shall compile submitted guest topics into a formatted PDF production sheet in under 1 second.</w:t>
             </w:r>
           </w:p>
         </w:tc>
@@ -725,7 +725,7 @@
         </w:tc>
         <w:tc>
           <w:tcPr>
-            <w:tcW w:type="dxa" w:w="3528"/>
+            <w:tcW w:type="dxa" w:w="3456"/>
           </w:tcPr>
           <w:p>
             <w:r/>
@@ -733,13 +733,13 @@
               <w:rPr>
                 <w:sz w:val="17"/>
               </w:rPr>
-              <w:t>Kiosk logs for 30 timed test orders show the time from first tap to payment approval is below 60 s for every order.</w:t>
+              <w:t>Benchmark: 100 episodes with up to 20 topics each, under a simulated peak load of 50 concurrent requests; the 95th-percentile generation time is below 1 s.</w:t>
             </w:r>
           </w:p>
         </w:tc>
         <w:tc>
           <w:tcPr>
-            <w:tcW w:type="dxa" w:w="2232"/>
+            <w:tcW w:type="dxa" w:w="2160"/>
           </w:tcPr>
           <w:p>
             <w:r/>
@@ -747,13 +747,13 @@
               <w:rPr>
                 <w:sz w:val="17"/>
               </w:rPr>
-              <w:t>Ensures quick service during peak hours.</w:t>
+              <w:t>Hosts often generate the sheet minutes before recording.</w:t>
             </w:r>
           </w:p>
         </w:tc>
         <w:tc>
           <w:tcPr>
-            <w:tcW w:type="dxa" w:w="2448"/>
+            <w:tcW w:type="dxa" w:w="2304"/>
           </w:tcPr>
           <w:p>
             <w:r/>
@@ -761,7 +761,7 @@
               <w:rPr>
                 <w:sz w:val="17"/>
               </w:rPr>
-              <w:t>Given in handout. Fixed the sample size (30 orders) so "consistently" is measurable.</w:t>
+              <w:t>Given in the problem statement. Added load level and percentile so the test is repeatable.</w:t>
             </w:r>
           </w:p>
         </w:tc>
@@ -783,7 +783,7 @@
         </w:tc>
         <w:tc>
           <w:tcPr>
-            <w:tcW w:type="dxa" w:w="1296"/>
+            <w:tcW w:type="dxa" w:w="1368"/>
           </w:tcPr>
           <w:p>
             <w:r/>
@@ -791,13 +791,13 @@
               <w:rPr>
                 <w:sz w:val="17"/>
               </w:rPr>
-              <w:t>Nonfunctional</w:t>
+              <w:t>Nonfunctional (Security &amp; Privacy)</w:t>
             </w:r>
           </w:p>
         </w:tc>
         <w:tc>
           <w:tcPr>
-            <w:tcW w:type="dxa" w:w="2952"/>
+            <w:tcW w:type="dxa" w:w="3024"/>
           </w:tcPr>
           <w:p>
             <w:r/>
@@ -805,7 +805,7 @@
               <w:rPr>
                 <w:sz w:val="17"/>
               </w:rPr>
-              <w:t>The system shall never store the full card number or CVV on the kiosk, and shall send card data to the payment gateway only over TLS 1.2 or higher.</w:t>
+              <w:t>The system shall protect guest booking links and personal data: links use unguessable tokens (at least 128-bit) and expire after booking or 14 days, guest contact details are visible only to that episode's host, and all traffic uses HTTPS.</w:t>
             </w:r>
           </w:p>
         </w:tc>
@@ -825,7 +825,7 @@
         </w:tc>
         <w:tc>
           <w:tcPr>
-            <w:tcW w:type="dxa" w:w="3528"/>
+            <w:tcW w:type="dxa" w:w="3456"/>
           </w:tcPr>
           <w:p>
             <w:r/>
@@ -833,13 +833,13 @@
               <w:rPr>
                 <w:sz w:val="17"/>
               </w:rPr>
-              <w:t>After 10 test payments, the kiosk database, logs and receipts contain no full card number or CVV (last 4 digits only), and a network capture shows only TLS 1.2+ connections to the gateway.</w:t>
+              <w:t>A used or 15-day-old link shows "Link expired"; another host's account receives HTTP 403 when opening the episode; a scan finds no plain-HTTP endpoints.</w:t>
             </w:r>
           </w:p>
         </w:tc>
         <w:tc>
           <w:tcPr>
-            <w:tcW w:type="dxa" w:w="2232"/>
+            <w:tcW w:type="dxa" w:w="2160"/>
           </w:tcPr>
           <w:p>
             <w:r/>
@@ -847,13 +847,13 @@
               <w:rPr>
                 <w:sz w:val="17"/>
               </w:rPr>
-              <w:t>Protects customers and keeps the kiosk PCI-DSS compliant.</w:t>
+              <w:t>Guests share email addresses and personal bios; leaked links would allow fake bookings.</w:t>
             </w:r>
           </w:p>
         </w:tc>
         <w:tc>
           <w:tcPr>
-            <w:tcW w:type="dxa" w:w="2448"/>
+            <w:tcW w:type="dxa" w:w="2304"/>
           </w:tcPr>
           <w:p>
             <w:r/>
@@ -861,7 +861,7 @@
               <w:rPr>
                 <w:sz w:val="17"/>
               </w:rPr>
-              <w:t>Split "secure payments" into two checks that can be inspected.</w:t>
+              <w:t>Split "secure the system" into three checks that can each pass or fail.</w:t>
             </w:r>
           </w:p>
         </w:tc>
@@ -900,7 +900,7 @@
       <w:tr>
         <w:tc>
           <w:tcPr>
-            <w:tcW w:type="dxa" w:w="3456"/>
+            <w:tcW w:type="dxa" w:w="2880"/>
             <w:shd w:val="clear" w:color="auto" w:fill="D9E2F3"/>
           </w:tcPr>
           <w:p>
@@ -916,7 +916,7 @@
         </w:tc>
         <w:tc>
           <w:tcPr>
-            <w:tcW w:type="dxa" w:w="3168"/>
+            <w:tcW w:type="dxa" w:w="4320"/>
             <w:shd w:val="clear" w:color="auto" w:fill="D9E2F3"/>
           </w:tcPr>
           <w:p>
@@ -932,7 +932,7 @@
         </w:tc>
         <w:tc>
           <w:tcPr>
-            <w:tcW w:type="dxa" w:w="7488"/>
+            <w:tcW w:type="dxa" w:w="6912"/>
             <w:shd w:val="clear" w:color="auto" w:fill="D9E2F3"/>
           </w:tcPr>
           <w:p>
@@ -950,7 +950,7 @@
       <w:tr>
         <w:tc>
           <w:tcPr>
-            <w:tcW w:type="dxa" w:w="3456"/>
+            <w:tcW w:type="dxa" w:w="2880"/>
           </w:tcPr>
           <w:p>
             <w:r/>
@@ -958,13 +958,13 @@
               <w:rPr>
                 <w:sz w:val="17"/>
               </w:rPr>
-              <w:t>Customer</w:t>
+              <w:t>Podcast Guest</w:t>
             </w:r>
           </w:p>
         </w:tc>
         <w:tc>
           <w:tcPr>
-            <w:tcW w:type="dxa" w:w="3168"/>
+            <w:tcW w:type="dxa" w:w="4320"/>
           </w:tcPr>
           <w:p>
             <w:r/>
@@ -978,7 +978,7 @@
         </w:tc>
         <w:tc>
           <w:tcPr>
-            <w:tcW w:type="dxa" w:w="7488"/>
+            <w:tcW w:type="dxa" w:w="6912"/>
           </w:tcPr>
           <w:p>
             <w:r/>
@@ -986,7 +986,7 @@
               <w:rPr>
                 <w:sz w:val="17"/>
               </w:rPr>
-              <w:t>Orders and pays for coffee at the kiosk.</w:t>
+              <w:t>Books an interview slot and submits talking points and biography links.</w:t>
             </w:r>
           </w:p>
         </w:tc>
@@ -994,7 +994,7 @@
       <w:tr>
         <w:tc>
           <w:tcPr>
-            <w:tcW w:type="dxa" w:w="3456"/>
+            <w:tcW w:type="dxa" w:w="2880"/>
           </w:tcPr>
           <w:p>
             <w:r/>
@@ -1002,13 +1002,13 @@
               <w:rPr>
                 <w:sz w:val="17"/>
               </w:rPr>
-              <w:t>Administrator (Cafe Manager)</w:t>
+              <w:t>Show Host</w:t>
             </w:r>
           </w:p>
         </w:tc>
         <w:tc>
           <w:tcPr>
-            <w:tcW w:type="dxa" w:w="3168"/>
+            <w:tcW w:type="dxa" w:w="4320"/>
           </w:tcPr>
           <w:p>
             <w:r/>
@@ -1022,7 +1022,7 @@
         </w:tc>
         <w:tc>
           <w:tcPr>
-            <w:tcW w:type="dxa" w:w="7488"/>
+            <w:tcW w:type="dxa" w:w="6912"/>
           </w:tcPr>
           <w:p>
             <w:r/>
@@ -1030,7 +1030,7 @@
               <w:rPr>
                 <w:sz w:val="17"/>
               </w:rPr>
-              <w:t>Maintains menu items and prices.</w:t>
+              <w:t>Publishes availability, reviews outlines, and produces the run-of-show.</w:t>
             </w:r>
           </w:p>
         </w:tc>
@@ -1038,7 +1038,7 @@
       <w:tr>
         <w:tc>
           <w:tcPr>
-            <w:tcW w:type="dxa" w:w="3456"/>
+            <w:tcW w:type="dxa" w:w="2880"/>
           </w:tcPr>
           <w:p>
             <w:r/>
@@ -1046,13 +1046,13 @@
               <w:rPr>
                 <w:sz w:val="17"/>
               </w:rPr>
-              <w:t>Payment Gateway</w:t>
+              <w:t>Calendar Service</w:t>
             </w:r>
           </w:p>
         </w:tc>
         <w:tc>
           <w:tcPr>
-            <w:tcW w:type="dxa" w:w="3168"/>
+            <w:tcW w:type="dxa" w:w="4320"/>
           </w:tcPr>
           <w:p>
             <w:r/>
@@ -1060,13 +1060,13 @@
               <w:rPr>
                 <w:sz w:val="17"/>
               </w:rPr>
-              <w:t>Secondary (external system)</w:t>
+              <w:t>Secondary (external system, e.g. Google Calendar)</w:t>
             </w:r>
           </w:p>
         </w:tc>
         <w:tc>
           <w:tcPr>
-            <w:tcW w:type="dxa" w:w="7488"/>
+            <w:tcW w:type="dxa" w:w="6912"/>
           </w:tcPr>
           <w:p>
             <w:r/>
@@ -1074,51 +1074,7 @@
               <w:rPr>
                 <w:sz w:val="17"/>
               </w:rPr>
-              <w:t>Authorizes credit card payments.</w:t>
-            </w:r>
-          </w:p>
-        </w:tc>
-      </w:tr>
-      <w:tr>
-        <w:tc>
-          <w:tcPr>
-            <w:tcW w:type="dxa" w:w="3456"/>
-          </w:tcPr>
-          <w:p>
-            <w:r/>
-            <w:r>
-              <w:rPr>
-                <w:sz w:val="17"/>
-              </w:rPr>
-              <w:t>Receipt Printer</w:t>
-            </w:r>
-          </w:p>
-        </w:tc>
-        <w:tc>
-          <w:tcPr>
-            <w:tcW w:type="dxa" w:w="3168"/>
-          </w:tcPr>
-          <w:p>
-            <w:r/>
-            <w:r>
-              <w:rPr>
-                <w:sz w:val="17"/>
-              </w:rPr>
-              <w:t>Secondary (device)</w:t>
-            </w:r>
-          </w:p>
-        </w:tc>
-        <w:tc>
-          <w:tcPr>
-            <w:tcW w:type="dxa" w:w="7488"/>
-          </w:tcPr>
-          <w:p>
-            <w:r/>
-            <w:r>
-              <w:rPr>
-                <w:sz w:val="17"/>
-              </w:rPr>
-              <w:t>Prints the customer receipt.</w:t>
+              <w:t>Delivers calendar invitations to host and guest.</w:t>
             </w:r>
           </w:p>
         </w:tc>
@@ -1174,7 +1130,7 @@
         </w:tc>
         <w:tc>
           <w:tcPr>
-            <w:tcW w:type="dxa" w:w="3456"/>
+            <w:tcW w:type="dxa" w:w="3744"/>
             <w:shd w:val="clear" w:color="auto" w:fill="D9E2F3"/>
           </w:tcPr>
           <w:p>
@@ -1190,7 +1146,7 @@
         </w:tc>
         <w:tc>
           <w:tcPr>
-            <w:tcW w:type="dxa" w:w="4320"/>
+            <w:tcW w:type="dxa" w:w="3744"/>
             <w:shd w:val="clear" w:color="auto" w:fill="D9E2F3"/>
           </w:tcPr>
           <w:p>
@@ -1200,13 +1156,13 @@
                 <w:b/>
                 <w:sz w:val="18"/>
               </w:rPr>
-              <w:t>Actors</w:t>
+              <w:t>Actor</w:t>
             </w:r>
           </w:p>
         </w:tc>
         <w:tc>
           <w:tcPr>
-            <w:tcW w:type="dxa" w:w="5184"/>
+            <w:tcW w:type="dxa" w:w="5472"/>
             <w:shd w:val="clear" w:color="auto" w:fill="D9E2F3"/>
           </w:tcPr>
           <w:p>
@@ -1238,7 +1194,7 @@
         </w:tc>
         <w:tc>
           <w:tcPr>
-            <w:tcW w:type="dxa" w:w="3456"/>
+            <w:tcW w:type="dxa" w:w="3744"/>
           </w:tcPr>
           <w:p>
             <w:r/>
@@ -1246,13 +1202,13 @@
               <w:rPr>
                 <w:sz w:val="17"/>
               </w:rPr>
-              <w:t>Select Coffee Type</w:t>
+              <w:t>Manage Availability</w:t>
             </w:r>
           </w:p>
         </w:tc>
         <w:tc>
           <w:tcPr>
-            <w:tcW w:type="dxa" w:w="4320"/>
+            <w:tcW w:type="dxa" w:w="3744"/>
           </w:tcPr>
           <w:p>
             <w:r/>
@@ -1260,13 +1216,129 @@
               <w:rPr>
                 <w:sz w:val="17"/>
               </w:rPr>
-              <w:t>Customer</w:t>
+              <w:t>Show Host</w:t>
             </w:r>
           </w:p>
         </w:tc>
         <w:tc>
           <w:tcPr>
-            <w:tcW w:type="dxa" w:w="5184"/>
+            <w:tcW w:type="dxa" w:w="5472"/>
+          </w:tcPr>
+          <w:p>
+            <w:r/>
+            <w:r>
+              <w:rPr>
+                <w:sz w:val="17"/>
+              </w:rPr>
+              <w:t>FR-002</w:t>
+            </w:r>
+          </w:p>
+        </w:tc>
+      </w:tr>
+      <w:tr>
+        <w:tc>
+          <w:tcPr>
+            <w:tcW w:type="dxa" w:w="1152"/>
+          </w:tcPr>
+          <w:p>
+            <w:r/>
+            <w:r>
+              <w:rPr>
+                <w:sz w:val="17"/>
+              </w:rPr>
+              <w:t>UC-02</w:t>
+            </w:r>
+          </w:p>
+        </w:tc>
+        <w:tc>
+          <w:tcPr>
+            <w:tcW w:type="dxa" w:w="3744"/>
+          </w:tcPr>
+          <w:p>
+            <w:r/>
+            <w:r>
+              <w:rPr>
+                <w:sz w:val="17"/>
+              </w:rPr>
+              <w:t>Book Interview Slot</w:t>
+            </w:r>
+          </w:p>
+        </w:tc>
+        <w:tc>
+          <w:tcPr>
+            <w:tcW w:type="dxa" w:w="3744"/>
+          </w:tcPr>
+          <w:p>
+            <w:r/>
+            <w:r>
+              <w:rPr>
+                <w:sz w:val="17"/>
+              </w:rPr>
+              <w:t>Podcast Guest</w:t>
+            </w:r>
+          </w:p>
+        </w:tc>
+        <w:tc>
+          <w:tcPr>
+            <w:tcW w:type="dxa" w:w="5472"/>
+          </w:tcPr>
+          <w:p>
+            <w:r/>
+            <w:r>
+              <w:rPr>
+                <w:sz w:val="17"/>
+              </w:rPr>
+              <w:t>FR-001, NFR-002</w:t>
+            </w:r>
+          </w:p>
+        </w:tc>
+      </w:tr>
+      <w:tr>
+        <w:tc>
+          <w:tcPr>
+            <w:tcW w:type="dxa" w:w="1152"/>
+          </w:tcPr>
+          <w:p>
+            <w:r/>
+            <w:r>
+              <w:rPr>
+                <w:sz w:val="17"/>
+              </w:rPr>
+              <w:t>UC-03</w:t>
+            </w:r>
+          </w:p>
+        </w:tc>
+        <w:tc>
+          <w:tcPr>
+            <w:tcW w:type="dxa" w:w="3744"/>
+          </w:tcPr>
+          <w:p>
+            <w:r/>
+            <w:r>
+              <w:rPr>
+                <w:sz w:val="17"/>
+              </w:rPr>
+              <w:t>Submit Topic Outline</w:t>
+            </w:r>
+          </w:p>
+        </w:tc>
+        <w:tc>
+          <w:tcPr>
+            <w:tcW w:type="dxa" w:w="3744"/>
+          </w:tcPr>
+          <w:p>
+            <w:r/>
+            <w:r>
+              <w:rPr>
+                <w:sz w:val="17"/>
+              </w:rPr>
+              <w:t>Podcast Guest</w:t>
+            </w:r>
+          </w:p>
+        </w:tc>
+        <w:tc>
+          <w:tcPr>
+            <w:tcW w:type="dxa" w:w="5472"/>
           </w:tcPr>
           <w:p>
             <w:r/>
@@ -1290,13 +1362,13 @@
               <w:rPr>
                 <w:sz w:val="17"/>
               </w:rPr>
-              <w:t>UC-02</w:t>
+              <w:t>UC-04</w:t>
             </w:r>
           </w:p>
         </w:tc>
         <w:tc>
           <w:tcPr>
-            <w:tcW w:type="dxa" w:w="3456"/>
+            <w:tcW w:type="dxa" w:w="3744"/>
           </w:tcPr>
           <w:p>
             <w:r/>
@@ -1304,13 +1376,13 @@
               <w:rPr>
                 <w:sz w:val="17"/>
               </w:rPr>
-              <w:t>Choose Drink Size</w:t>
+              <w:t>Send Calendar Invite</w:t>
             </w:r>
           </w:p>
         </w:tc>
         <w:tc>
           <w:tcPr>
-            <w:tcW w:type="dxa" w:w="4320"/>
+            <w:tcW w:type="dxa" w:w="3744"/>
           </w:tcPr>
           <w:p>
             <w:r/>
@@ -1318,13 +1390,13 @@
               <w:rPr>
                 <w:sz w:val="17"/>
               </w:rPr>
-              <w:t>Customer</w:t>
+              <w:t>Calendar Service</w:t>
             </w:r>
           </w:p>
         </w:tc>
         <w:tc>
           <w:tcPr>
-            <w:tcW w:type="dxa" w:w="5184"/>
+            <w:tcW w:type="dxa" w:w="5472"/>
           </w:tcPr>
           <w:p>
             <w:r/>
@@ -1332,123 +1404,7 @@
               <w:rPr>
                 <w:sz w:val="17"/>
               </w:rPr>
-              <w:t>FR-002</w:t>
-            </w:r>
-          </w:p>
-        </w:tc>
-      </w:tr>
-      <w:tr>
-        <w:tc>
-          <w:tcPr>
-            <w:tcW w:type="dxa" w:w="1152"/>
-          </w:tcPr>
-          <w:p>
-            <w:r/>
-            <w:r>
-              <w:rPr>
-                <w:sz w:val="17"/>
-              </w:rPr>
-              <w:t>UC-03</w:t>
-            </w:r>
-          </w:p>
-        </w:tc>
-        <w:tc>
-          <w:tcPr>
-            <w:tcW w:type="dxa" w:w="3456"/>
-          </w:tcPr>
-          <w:p>
-            <w:r/>
-            <w:r>
-              <w:rPr>
-                <w:sz w:val="17"/>
-              </w:rPr>
-              <w:t>Place Order</w:t>
-            </w:r>
-          </w:p>
-        </w:tc>
-        <w:tc>
-          <w:tcPr>
-            <w:tcW w:type="dxa" w:w="4320"/>
-          </w:tcPr>
-          <w:p>
-            <w:r/>
-            <w:r>
-              <w:rPr>
-                <w:sz w:val="17"/>
-              </w:rPr>
-              <w:t>Customer</w:t>
-            </w:r>
-          </w:p>
-        </w:tc>
-        <w:tc>
-          <w:tcPr>
-            <w:tcW w:type="dxa" w:w="5184"/>
-          </w:tcPr>
-          <w:p>
-            <w:r/>
-            <w:r>
-              <w:rPr>
-                <w:sz w:val="17"/>
-              </w:rPr>
-              <w:t>FR-001..FR-004, NFR-001</w:t>
-            </w:r>
-          </w:p>
-        </w:tc>
-      </w:tr>
-      <w:tr>
-        <w:tc>
-          <w:tcPr>
-            <w:tcW w:type="dxa" w:w="1152"/>
-          </w:tcPr>
-          <w:p>
-            <w:r/>
-            <w:r>
-              <w:rPr>
-                <w:sz w:val="17"/>
-              </w:rPr>
-              <w:t>UC-04</w:t>
-            </w:r>
-          </w:p>
-        </w:tc>
-        <w:tc>
-          <w:tcPr>
-            <w:tcW w:type="dxa" w:w="3456"/>
-          </w:tcPr>
-          <w:p>
-            <w:r/>
-            <w:r>
-              <w:rPr>
-                <w:sz w:val="17"/>
-              </w:rPr>
-              <w:t>Pay by Credit Card</w:t>
-            </w:r>
-          </w:p>
-        </w:tc>
-        <w:tc>
-          <w:tcPr>
-            <w:tcW w:type="dxa" w:w="4320"/>
-          </w:tcPr>
-          <w:p>
-            <w:r/>
-            <w:r>
-              <w:rPr>
-                <w:sz w:val="17"/>
-              </w:rPr>
-              <w:t>Customer, Payment Gateway</w:t>
-            </w:r>
-          </w:p>
-        </w:tc>
-        <w:tc>
-          <w:tcPr>
-            <w:tcW w:type="dxa" w:w="5184"/>
-          </w:tcPr>
-          <w:p>
-            <w:r/>
-            <w:r>
-              <w:rPr>
-                <w:sz w:val="17"/>
-              </w:rPr>
-              <w:t>FR-003, NFR-002</w:t>
+              <w:t>FR-003</w:t>
             </w:r>
           </w:p>
         </w:tc>
@@ -1470,7 +1426,7 @@
         </w:tc>
         <w:tc>
           <w:tcPr>
-            <w:tcW w:type="dxa" w:w="3456"/>
+            <w:tcW w:type="dxa" w:w="3744"/>
           </w:tcPr>
           <w:p>
             <w:r/>
@@ -1478,13 +1434,13 @@
               <w:rPr>
                 <w:sz w:val="17"/>
               </w:rPr>
-              <w:t>Print Receipt</w:t>
+              <w:t>Join Waitlist</w:t>
             </w:r>
           </w:p>
         </w:tc>
         <w:tc>
           <w:tcPr>
-            <w:tcW w:type="dxa" w:w="4320"/>
+            <w:tcW w:type="dxa" w:w="3744"/>
           </w:tcPr>
           <w:p>
             <w:r/>
@@ -1492,13 +1448,71 @@
               <w:rPr>
                 <w:sz w:val="17"/>
               </w:rPr>
-              <w:t>Receipt Printer</w:t>
+              <w:t>Podcast Guest</w:t>
             </w:r>
           </w:p>
         </w:tc>
         <w:tc>
           <w:tcPr>
-            <w:tcW w:type="dxa" w:w="5184"/>
+            <w:tcW w:type="dxa" w:w="5472"/>
+          </w:tcPr>
+          <w:p>
+            <w:r/>
+            <w:r>
+              <w:rPr>
+                <w:sz w:val="17"/>
+              </w:rPr>
+              <w:t>FR-001 (no free slot)</w:t>
+            </w:r>
+          </w:p>
+        </w:tc>
+      </w:tr>
+      <w:tr>
+        <w:tc>
+          <w:tcPr>
+            <w:tcW w:type="dxa" w:w="1152"/>
+          </w:tcPr>
+          <w:p>
+            <w:r/>
+            <w:r>
+              <w:rPr>
+                <w:sz w:val="17"/>
+              </w:rPr>
+              <w:t>UC-06</w:t>
+            </w:r>
+          </w:p>
+        </w:tc>
+        <w:tc>
+          <w:tcPr>
+            <w:tcW w:type="dxa" w:w="3744"/>
+          </w:tcPr>
+          <w:p>
+            <w:r/>
+            <w:r>
+              <w:rPr>
+                <w:sz w:val="17"/>
+              </w:rPr>
+              <w:t>Review Episode Board</w:t>
+            </w:r>
+          </w:p>
+        </w:tc>
+        <w:tc>
+          <w:tcPr>
+            <w:tcW w:type="dxa" w:w="3744"/>
+          </w:tcPr>
+          <w:p>
+            <w:r/>
+            <w:r>
+              <w:rPr>
+                <w:sz w:val="17"/>
+              </w:rPr>
+              <w:t>Show Host</w:t>
+            </w:r>
+          </w:p>
+        </w:tc>
+        <w:tc>
+          <w:tcPr>
+            <w:tcW w:type="dxa" w:w="5472"/>
           </w:tcPr>
           <w:p>
             <w:r/>
@@ -1522,13 +1536,13 @@
               <w:rPr>
                 <w:sz w:val="17"/>
               </w:rPr>
-              <w:t>UC-06</w:t>
+              <w:t>UC-07</w:t>
             </w:r>
           </w:p>
         </w:tc>
         <w:tc>
           <w:tcPr>
-            <w:tcW w:type="dxa" w:w="3456"/>
+            <w:tcW w:type="dxa" w:w="3744"/>
           </w:tcPr>
           <w:p>
             <w:r/>
@@ -1536,13 +1550,13 @@
               <w:rPr>
                 <w:sz w:val="17"/>
               </w:rPr>
-              <w:t>Manage Menu &amp; Prices</w:t>
+              <w:t>Generate Run-of-Show PDF</w:t>
             </w:r>
           </w:p>
         </w:tc>
         <w:tc>
           <w:tcPr>
-            <w:tcW w:type="dxa" w:w="4320"/>
+            <w:tcW w:type="dxa" w:w="3744"/>
           </w:tcPr>
           <w:p>
             <w:r/>
@@ -1550,13 +1564,13 @@
               <w:rPr>
                 <w:sz w:val="17"/>
               </w:rPr>
-              <w:t>Administrator</w:t>
+              <w:t>Show Host</w:t>
             </w:r>
           </w:p>
         </w:tc>
         <w:tc>
           <w:tcPr>
-            <w:tcW w:type="dxa" w:w="5184"/>
+            <w:tcW w:type="dxa" w:w="5472"/>
           </w:tcPr>
           <w:p>
             <w:r/>
@@ -1564,7 +1578,7 @@
               <w:rPr>
                 <w:sz w:val="17"/>
               </w:rPr>
-              <w:t>FR-005</w:t>
+              <w:t>FR-005, NFR-001</w:t>
             </w:r>
           </w:p>
         </w:tc>
@@ -1580,13 +1594,13 @@
               <w:rPr>
                 <w:sz w:val="17"/>
               </w:rPr>
-              <w:t>UC-07</w:t>
+              <w:t>UC-08</w:t>
             </w:r>
           </w:p>
         </w:tc>
         <w:tc>
           <w:tcPr>
-            <w:tcW w:type="dxa" w:w="3456"/>
+            <w:tcW w:type="dxa" w:w="3744"/>
           </w:tcPr>
           <w:p>
             <w:r/>
@@ -1594,13 +1608,13 @@
               <w:rPr>
                 <w:sz w:val="17"/>
               </w:rPr>
-              <w:t>Retry Payment</w:t>
+              <w:t>Compute Segment Timestamps</w:t>
             </w:r>
           </w:p>
         </w:tc>
         <w:tc>
           <w:tcPr>
-            <w:tcW w:type="dxa" w:w="4320"/>
+            <w:tcW w:type="dxa" w:w="3744"/>
           </w:tcPr>
           <w:p>
             <w:r/>
@@ -1608,13 +1622,13 @@
               <w:rPr>
                 <w:sz w:val="17"/>
               </w:rPr>
-              <w:t>Customer, Payment Gateway</w:t>
+              <w:t>(internal)</w:t>
             </w:r>
           </w:p>
         </w:tc>
         <w:tc>
           <w:tcPr>
-            <w:tcW w:type="dxa" w:w="5184"/>
+            <w:tcW w:type="dxa" w:w="5472"/>
           </w:tcPr>
           <w:p>
             <w:r/>
@@ -1622,7 +1636,7 @@
               <w:rPr>
                 <w:sz w:val="17"/>
               </w:rPr>
-              <w:t>FR-003 (declined card)</w:t>
+              <w:t>FR-005</w:t>
             </w:r>
           </w:p>
         </w:tc>
@@ -1639,7 +1653,7 @@
           <w:color w:val="555F6D"/>
           <w:sz w:val="17"/>
         </w:rPr>
-        <w:t>Relationships: UC-03 Place Order «include» UC-04 Pay by Credit Card and «include» UC-05 Print Receipt (always performed). UC-07 Retry Payment «extend» UC-04 (only when the card is declined).</w:t>
+        <w:t>Relationships: UC-02 Book Interview Slot «include» UC-04 Send Calendar Invite (always sent on booking). UC-07 Generate Run-of-Show PDF «include» UC-08 Compute Segment Timestamps. UC-05 Join Waitlist «extend» UC-02 (only when no free slot is available).</w:t>
       </w:r>
     </w:p>
     <w:sectPr>

</xml_diff>